<commit_message>
Template updated for both experienced and fresher
</commit_message>
<xml_diff>
--- a/src/template/resume_template_fresher.docx
+++ b/src/template/resume_template_fresher.docx
@@ -4,63 +4,63 @@
   <w:body>
     <w:p>
       <w:pPr>
-        <w:spacing w:after="40" w:before="0"/>
-        <w:jc w:val="center"/>
-      </w:pPr>
-      <w:r>
-        <w:rPr>
-          <w:rFonts w:ascii="Arial" w:cs="Arial" w:eastAsia="Arial" w:hAnsi="Arial"/>
-          <w:b/>
-          <w:bCs/>
-          <w:color w:val="1a1a2e"/>
-          <w:sz w:val="40"/>
-          <w:szCs w:val="40"/>
-        </w:rPr>
-        <w:t xml:space="preserve">{{FULL_NAME}}</w:t>
-      </w:r>
-    </w:p>
-    <w:p>
-      <w:pPr>
         <w:spacing w:after="60" w:before="0"/>
         <w:jc w:val="center"/>
       </w:pPr>
       <w:r>
         <w:rPr>
+          <w:rFonts w:ascii="Arial" w:cs="Arial" w:eastAsia="Arial" w:hAnsi="Arial"/>
+          <w:b/>
+          <w:bCs/>
+          <w:color w:val="1a1a2e"/>
+          <w:sz w:val="44"/>
+          <w:szCs w:val="44"/>
+        </w:rPr>
+        <w:t xml:space="preserve">{{FULL_NAME}}</w:t>
+      </w:r>
+    </w:p>
+    <w:p>
+      <w:pPr>
+        <w:spacing w:after="80" w:before="0"/>
+        <w:jc w:val="center"/>
+      </w:pPr>
+      <w:r>
+        <w:rPr>
           <w:color w:val="444444"/>
-          <w:sz w:val="20"/>
-          <w:szCs w:val="20"/>
+          <w:sz w:val="21"/>
+          <w:szCs w:val="21"/>
         </w:rPr>
         <w:t xml:space="preserve">☎ </w:t>
       </w:r>
       <w:r>
         <w:rPr>
           <w:color w:val="444444"/>
-          <w:sz w:val="20"/>
-          <w:szCs w:val="20"/>
+          <w:sz w:val="21"/>
+          <w:szCs w:val="21"/>
         </w:rPr>
         <w:t xml:space="preserve">{{PHONE}}</w:t>
       </w:r>
       <w:r>
         <w:rPr>
           <w:color w:val="888888"/>
-          <w:sz w:val="20"/>
-          <w:szCs w:val="20"/>
+          <w:sz w:val="21"/>
+          <w:szCs w:val="21"/>
         </w:rPr>
         <w:t xml:space="preserve">   |   </w:t>
       </w:r>
       <w:r>
         <w:rPr>
           <w:color w:val="444444"/>
-          <w:sz w:val="20"/>
-          <w:szCs w:val="20"/>
+          <w:sz w:val="21"/>
+          <w:szCs w:val="21"/>
         </w:rPr>
         <w:t xml:space="preserve">📍 </w:t>
       </w:r>
       <w:r>
         <w:rPr>
           <w:color w:val="444444"/>
-          <w:sz w:val="20"/>
-          <w:szCs w:val="20"/>
+          <w:sz w:val="21"/>
+          <w:szCs w:val="21"/>
         </w:rPr>
         <w:t xml:space="preserve">{{CITY}}, India</w:t>
       </w:r>
@@ -70,7 +70,7 @@
         <w:pBdr>
           <w:bottom w:val="single" w:color="1a1a2e" w:sz="12" w:space="1"/>
         </w:pBdr>
-        <w:spacing w:after="120" w:before="0"/>
+        <w:spacing w:after="160" w:before="0"/>
       </w:pPr>
     </w:p>
     <w:p>
@@ -78,7 +78,7 @@
         <w:pBdr>
           <w:bottom w:val="single" w:color="cccccc" w:sz="4" w:space="4"/>
         </w:pBdr>
-        <w:spacing w:after="40" w:before="0"/>
+        <w:spacing w:after="60" w:before="0"/>
       </w:pPr>
       <w:r>
         <w:rPr>
@@ -87,24 +87,23 @@
           <w:bCs/>
           <w:caps/>
           <w:color w:val="1a1a2e"/>
-          <w:sz w:val="22"/>
-          <w:szCs w:val="22"/>
+          <w:sz w:val="23"/>
+          <w:szCs w:val="23"/>
         </w:rPr>
         <w:t xml:space="preserve">OBJECTIVE</w:t>
       </w:r>
     </w:p>
     <w:p>
       <w:pPr>
-        <w:spacing w:after="120" w:before="60"/>
-      </w:pPr>
-      <w:r>
-        <w:rPr>
-          <w:rFonts w:ascii="Arial" w:cs="Arial" w:eastAsia="Arial" w:hAnsi="Arial"/>
+        <w:spacing w:after="160" w:before="80"/>
+      </w:pPr>
+      <w:r>
+        <w:rPr>
           <w:i/>
           <w:iCs/>
           <w:color w:val="333333"/>
-          <w:sz w:val="20"/>
-          <w:szCs w:val="20"/>
+          <w:sz w:val="21"/>
+          <w:szCs w:val="21"/>
         </w:rPr>
         <w:t xml:space="preserve">{{OBJECTIVE_LINE}}</w:t>
       </w:r>
@@ -114,7 +113,7 @@
         <w:pBdr>
           <w:bottom w:val="single" w:color="cccccc" w:sz="4" w:space="4"/>
         </w:pBdr>
-        <w:spacing w:after="40" w:before="0"/>
+        <w:spacing w:after="60" w:before="0"/>
       </w:pPr>
       <w:r>
         <w:rPr>
@@ -123,29 +122,29 @@
           <w:bCs/>
           <w:caps/>
           <w:color w:val="1a1a2e"/>
-          <w:sz w:val="22"/>
-          <w:szCs w:val="22"/>
+          <w:sz w:val="23"/>
+          <w:szCs w:val="23"/>
         </w:rPr>
         <w:t xml:space="preserve">EDUCATION</w:t>
       </w:r>
     </w:p>
     <w:p>
       <w:pPr>
-        <w:spacing w:after="20" w:before="60"/>
-      </w:pPr>
-      <w:r>
-        <w:rPr>
-          <w:b/>
-          <w:bCs/>
-          <w:sz w:val="20"/>
-          <w:szCs w:val="20"/>
+        <w:spacing w:after="30" w:before="80"/>
+      </w:pPr>
+      <w:r>
+        <w:rPr>
+          <w:b/>
+          <w:bCs/>
+          <w:sz w:val="21"/>
+          <w:szCs w:val="21"/>
         </w:rPr>
         <w:t xml:space="preserve">{{EDUCATION}}</w:t>
       </w:r>
     </w:p>
     <w:p>
       <w:pPr>
-        <w:spacing w:after="120" w:before="0"/>
+        <w:spacing w:after="160" w:before="0"/>
       </w:pPr>
       <w:r>
         <w:rPr>
@@ -161,7 +160,7 @@
         <w:pBdr>
           <w:bottom w:val="single" w:color="cccccc" w:sz="4" w:space="4"/>
         </w:pBdr>
-        <w:spacing w:after="40" w:before="0"/>
+        <w:spacing w:after="60" w:before="0"/>
       </w:pPr>
       <w:r>
         <w:rPr>
@@ -170,8 +169,8 @@
           <w:bCs/>
           <w:caps/>
           <w:color w:val="1a1a2e"/>
-          <w:sz w:val="22"/>
-          <w:szCs w:val="22"/>
+          <w:sz w:val="23"/>
+          <w:szCs w:val="23"/>
         </w:rPr>
         <w:t xml:space="preserve">SKILLS &amp; STRENGTHS</w:t>
       </w:r>
@@ -183,12 +182,12 @@
           <w:ilvl w:val="0"/>
           <w:numId w:val="2"/>
         </w:numPr>
-        <w:spacing w:before="60"/>
-      </w:pPr>
-      <w:r>
-        <w:rPr>
-          <w:sz w:val="20"/>
-          <w:szCs w:val="20"/>
+        <w:spacing w:before="80"/>
+      </w:pPr>
+      <w:r>
+        <w:rPr>
+          <w:sz w:val="21"/>
+          <w:szCs w:val="21"/>
         </w:rPr>
         <w:t xml:space="preserve">{{SKILL_1}}</w:t>
       </w:r>
@@ -203,8 +202,8 @@
       </w:pPr>
       <w:r>
         <w:rPr>
-          <w:sz w:val="20"/>
-          <w:szCs w:val="20"/>
+          <w:sz w:val="21"/>
+          <w:szCs w:val="21"/>
         </w:rPr>
         <w:t xml:space="preserve">{{SKILL_2}}</w:t>
       </w:r>
@@ -219,8 +218,8 @@
       </w:pPr>
       <w:r>
         <w:rPr>
-          <w:sz w:val="20"/>
-          <w:szCs w:val="20"/>
+          <w:sz w:val="21"/>
+          <w:szCs w:val="21"/>
         </w:rPr>
         <w:t xml:space="preserve">{{SKILL_3}}</w:t>
       </w:r>
@@ -235,8 +234,8 @@
       </w:pPr>
       <w:r>
         <w:rPr>
-          <w:sz w:val="20"/>
-          <w:szCs w:val="20"/>
+          <w:sz w:val="21"/>
+          <w:szCs w:val="21"/>
         </w:rPr>
         <w:t xml:space="preserve">Hard-working and dedicated with strong work ethic</w:t>
       </w:r>
@@ -251,8 +250,8 @@
       </w:pPr>
       <w:r>
         <w:rPr>
-          <w:sz w:val="20"/>
-          <w:szCs w:val="20"/>
+          <w:sz w:val="21"/>
+          <w:szCs w:val="21"/>
         </w:rPr>
         <w:t xml:space="preserve">Punctual and reliable with excellent attendance record</w:t>
       </w:r>
@@ -264,12 +263,12 @@
           <w:ilvl w:val="0"/>
           <w:numId w:val="2"/>
         </w:numPr>
-        <w:spacing w:after="120"/>
-      </w:pPr>
-      <w:r>
-        <w:rPr>
-          <w:sz w:val="20"/>
-          <w:szCs w:val="20"/>
+        <w:spacing w:after="160"/>
+      </w:pPr>
+      <w:r>
+        <w:rPr>
+          <w:sz w:val="21"/>
+          <w:szCs w:val="21"/>
         </w:rPr>
         <w:t xml:space="preserve">Quick learner with willingness to take on new responsibilities</w:t>
       </w:r>
@@ -279,7 +278,7 @@
         <w:pBdr>
           <w:bottom w:val="single" w:color="cccccc" w:sz="4" w:space="4"/>
         </w:pBdr>
-        <w:spacing w:after="40" w:before="0"/>
+        <w:spacing w:after="60" w:before="0"/>
       </w:pPr>
       <w:r>
         <w:rPr>
@@ -288,8 +287,8 @@
           <w:bCs/>
           <w:caps/>
           <w:color w:val="1a1a2e"/>
-          <w:sz w:val="22"/>
-          <w:szCs w:val="22"/>
+          <w:sz w:val="23"/>
+          <w:szCs w:val="23"/>
         </w:rPr>
         <w:t xml:space="preserve">WHY HIRE ME</w:t>
       </w:r>
@@ -301,12 +300,12 @@
           <w:ilvl w:val="0"/>
           <w:numId w:val="2"/>
         </w:numPr>
-        <w:spacing w:before="60"/>
-      </w:pPr>
-      <w:r>
-        <w:rPr>
-          <w:sz w:val="20"/>
-          <w:szCs w:val="20"/>
+        <w:spacing w:before="80"/>
+      </w:pPr>
+      <w:r>
+        <w:rPr>
+          <w:sz w:val="21"/>
+          <w:szCs w:val="21"/>
         </w:rPr>
         <w:t xml:space="preserve">Available to join immediately with full commitment</w:t>
       </w:r>
@@ -321,8 +320,8 @@
       </w:pPr>
       <w:r>
         <w:rPr>
-          <w:sz w:val="20"/>
-          <w:szCs w:val="20"/>
+          <w:sz w:val="21"/>
+          <w:szCs w:val="21"/>
         </w:rPr>
         <w:t xml:space="preserve">Physically fit and capable of handling demanding work</w:t>
       </w:r>
@@ -337,8 +336,8 @@
       </w:pPr>
       <w:r>
         <w:rPr>
-          <w:sz w:val="20"/>
-          <w:szCs w:val="20"/>
+          <w:sz w:val="21"/>
+          <w:szCs w:val="21"/>
         </w:rPr>
         <w:t xml:space="preserve">Familiar with local routes and areas in {{CITY}}</w:t>
       </w:r>
@@ -350,12 +349,12 @@
           <w:ilvl w:val="0"/>
           <w:numId w:val="2"/>
         </w:numPr>
-        <w:spacing w:after="120"/>
-      </w:pPr>
-      <w:r>
-        <w:rPr>
-          <w:sz w:val="20"/>
-          <w:szCs w:val="20"/>
+        <w:spacing w:after="160"/>
+      </w:pPr>
+      <w:r>
+        <w:rPr>
+          <w:sz w:val="21"/>
+          <w:szCs w:val="21"/>
         </w:rPr>
         <w:t xml:space="preserve">Owns {{VEHICLE}} — ready for field or delivery work</w:t>
       </w:r>
@@ -365,7 +364,7 @@
         <w:pBdr>
           <w:bottom w:val="single" w:color="cccccc" w:sz="4" w:space="4"/>
         </w:pBdr>
-        <w:spacing w:after="40" w:before="0"/>
+        <w:spacing w:after="60" w:before="0"/>
       </w:pPr>
       <w:r>
         <w:rPr>
@@ -374,8 +373,151 @@
           <w:bCs/>
           <w:caps/>
           <w:color w:val="1a1a2e"/>
-          <w:sz w:val="22"/>
-          <w:szCs w:val="22"/>
+          <w:sz w:val="23"/>
+          <w:szCs w:val="23"/>
+        </w:rPr>
+        <w:t xml:space="preserve">LANGUAGES KNOWN</w:t>
+      </w:r>
+    </w:p>
+    <w:p>
+      <w:pPr>
+        <w:pStyle w:val="ListParagraph"/>
+        <w:numPr>
+          <w:ilvl w:val="0"/>
+          <w:numId w:val="2"/>
+        </w:numPr>
+        <w:spacing w:before="80"/>
+      </w:pPr>
+      <w:r>
+        <w:rPr>
+          <w:sz w:val="21"/>
+          <w:szCs w:val="21"/>
+        </w:rPr>
+        <w:t xml:space="preserve">Hindi (Fluent)</w:t>
+      </w:r>
+    </w:p>
+    <w:p>
+      <w:pPr>
+        <w:pStyle w:val="ListParagraph"/>
+        <w:numPr>
+          <w:ilvl w:val="0"/>
+          <w:numId w:val="2"/>
+        </w:numPr>
+        <w:spacing w:after="160"/>
+      </w:pPr>
+      <w:r>
+        <w:rPr>
+          <w:sz w:val="21"/>
+          <w:szCs w:val="21"/>
+        </w:rPr>
+        <w:t xml:space="preserve">English (Basic)</w:t>
+      </w:r>
+    </w:p>
+    <w:p>
+      <w:pPr>
+        <w:pBdr>
+          <w:bottom w:val="single" w:color="cccccc" w:sz="4" w:space="4"/>
+        </w:pBdr>
+        <w:spacing w:after="60" w:before="0"/>
+      </w:pPr>
+      <w:r>
+        <w:rPr>
+          <w:rFonts w:ascii="Arial" w:cs="Arial" w:eastAsia="Arial" w:hAnsi="Arial"/>
+          <w:b/>
+          <w:bCs/>
+          <w:caps/>
+          <w:color w:val="1a1a2e"/>
+          <w:sz w:val="23"/>
+          <w:szCs w:val="23"/>
+        </w:rPr>
+        <w:t xml:space="preserve">HOBBIES &amp; INTERESTS</w:t>
+      </w:r>
+    </w:p>
+    <w:p>
+      <w:pPr>
+        <w:pStyle w:val="ListParagraph"/>
+        <w:numPr>
+          <w:ilvl w:val="0"/>
+          <w:numId w:val="2"/>
+        </w:numPr>
+        <w:spacing w:before="80"/>
+      </w:pPr>
+      <w:r>
+        <w:rPr>
+          <w:sz w:val="21"/>
+          <w:szCs w:val="21"/>
+        </w:rPr>
+        <w:t xml:space="preserve">{{HOBBY_1}}</w:t>
+      </w:r>
+    </w:p>
+    <w:p>
+      <w:pPr>
+        <w:pStyle w:val="ListParagraph"/>
+        <w:numPr>
+          <w:ilvl w:val="0"/>
+          <w:numId w:val="2"/>
+        </w:numPr>
+        <w:spacing w:after="160"/>
+      </w:pPr>
+      <w:r>
+        <w:rPr>
+          <w:sz w:val="21"/>
+          <w:szCs w:val="21"/>
+        </w:rPr>
+        <w:t xml:space="preserve">{{HOBBY_2}}</w:t>
+      </w:r>
+    </w:p>
+    <w:p>
+      <w:pPr>
+        <w:pBdr>
+          <w:bottom w:val="single" w:color="cccccc" w:sz="4" w:space="4"/>
+        </w:pBdr>
+        <w:spacing w:after="60" w:before="0"/>
+      </w:pPr>
+      <w:r>
+        <w:rPr>
+          <w:rFonts w:ascii="Arial" w:cs="Arial" w:eastAsia="Arial" w:hAnsi="Arial"/>
+          <w:b/>
+          <w:bCs/>
+          <w:caps/>
+          <w:color w:val="1a1a2e"/>
+          <w:sz w:val="23"/>
+          <w:szCs w:val="23"/>
+        </w:rPr>
+        <w:t xml:space="preserve">CAREER GOAL</w:t>
+      </w:r>
+    </w:p>
+    <w:p>
+      <w:pPr>
+        <w:spacing w:after="160" w:before="80"/>
+      </w:pPr>
+      <w:r>
+        <w:rPr>
+          <w:i/>
+          <w:iCs/>
+          <w:color w:val="333333"/>
+          <w:sz w:val="21"/>
+          <w:szCs w:val="21"/>
+        </w:rPr>
+        <w:t xml:space="preserve">{{CAREER_GOAL_LINE}}</w:t>
+      </w:r>
+    </w:p>
+    <w:p>
+      <w:pPr>
+        <w:pBdr>
+          <w:bottom w:val="single" w:color="cccccc" w:sz="4" w:space="4"/>
+        </w:pBdr>
+        <w:spacing w:after="60" w:before="0"/>
+      </w:pPr>
+      <w:r>
+        <w:rPr>
+          <w:rFonts w:ascii="Arial" w:cs="Arial" w:eastAsia="Arial" w:hAnsi="Arial"/>
+          <w:b/>
+          <w:bCs/>
+          <w:caps/>
+          <w:color w:val="1a1a2e"/>
+          <w:sz w:val="23"/>
+          <w:szCs w:val="23"/>
         </w:rPr>
         <w:t xml:space="preserve">PERSONAL INFORMATION</w:t>
       </w:r>
@@ -385,28 +527,28 @@
         <w:tabs>
           <w:tab w:val="left" w:pos="1800"/>
         </w:tabs>
-        <w:spacing w:after="20" w:before="60"/>
-      </w:pPr>
-      <w:r>
-        <w:rPr>
-          <w:b/>
-          <w:bCs/>
-          <w:sz w:val="20"/>
-          <w:szCs w:val="20"/>
+        <w:spacing w:after="30" w:before="80"/>
+      </w:pPr>
+      <w:r>
+        <w:rPr>
+          <w:b/>
+          <w:bCs/>
+          <w:sz w:val="21"/>
+          <w:szCs w:val="21"/>
         </w:rPr>
         <w:t xml:space="preserve">Full Name</w:t>
       </w:r>
       <w:r>
         <w:rPr>
-          <w:sz w:val="20"/>
-          <w:szCs w:val="20"/>
+          <w:sz w:val="21"/>
+          <w:szCs w:val="21"/>
         </w:rPr>
         <w:t xml:space="preserve">	:  </w:t>
       </w:r>
       <w:r>
         <w:rPr>
-          <w:sz w:val="20"/>
-          <w:szCs w:val="20"/>
+          <w:sz w:val="21"/>
+          <w:szCs w:val="21"/>
         </w:rPr>
         <w:t xml:space="preserve">{{FULL_NAME}}</w:t>
       </w:r>
@@ -416,28 +558,28 @@
         <w:tabs>
           <w:tab w:val="left" w:pos="1800"/>
         </w:tabs>
-        <w:spacing w:after="20" w:before="0"/>
-      </w:pPr>
-      <w:r>
-        <w:rPr>
-          <w:b/>
-          <w:bCs/>
-          <w:sz w:val="20"/>
-          <w:szCs w:val="20"/>
+        <w:spacing w:after="30" w:before="0"/>
+      </w:pPr>
+      <w:r>
+        <w:rPr>
+          <w:b/>
+          <w:bCs/>
+          <w:sz w:val="21"/>
+          <w:szCs w:val="21"/>
         </w:rPr>
         <w:t xml:space="preserve">Location</w:t>
       </w:r>
       <w:r>
         <w:rPr>
-          <w:sz w:val="20"/>
-          <w:szCs w:val="20"/>
+          <w:sz w:val="21"/>
+          <w:szCs w:val="21"/>
         </w:rPr>
         <w:t xml:space="preserve">	:  </w:t>
       </w:r>
       <w:r>
         <w:rPr>
-          <w:sz w:val="20"/>
-          <w:szCs w:val="20"/>
+          <w:sz w:val="21"/>
+          <w:szCs w:val="21"/>
         </w:rPr>
         <w:t xml:space="preserve">{{CITY}}, India</w:t>
       </w:r>
@@ -447,28 +589,28 @@
         <w:tabs>
           <w:tab w:val="left" w:pos="1800"/>
         </w:tabs>
-        <w:spacing w:after="20" w:before="0"/>
-      </w:pPr>
-      <w:r>
-        <w:rPr>
-          <w:b/>
-          <w:bCs/>
-          <w:sz w:val="20"/>
-          <w:szCs w:val="20"/>
+        <w:spacing w:after="30" w:before="0"/>
+      </w:pPr>
+      <w:r>
+        <w:rPr>
+          <w:b/>
+          <w:bCs/>
+          <w:sz w:val="21"/>
+          <w:szCs w:val="21"/>
         </w:rPr>
         <w:t xml:space="preserve">Mobile</w:t>
       </w:r>
       <w:r>
         <w:rPr>
-          <w:sz w:val="20"/>
-          <w:szCs w:val="20"/>
+          <w:sz w:val="21"/>
+          <w:szCs w:val="21"/>
         </w:rPr>
         <w:t xml:space="preserve">	:  </w:t>
       </w:r>
       <w:r>
         <w:rPr>
-          <w:sz w:val="20"/>
-          <w:szCs w:val="20"/>
+          <w:sz w:val="21"/>
+          <w:szCs w:val="21"/>
         </w:rPr>
         <w:t xml:space="preserve">{{PHONE}}</w:t>
       </w:r>
@@ -478,28 +620,28 @@
         <w:tabs>
           <w:tab w:val="left" w:pos="1800"/>
         </w:tabs>
-        <w:spacing w:after="120" w:before="0"/>
-      </w:pPr>
-      <w:r>
-        <w:rPr>
-          <w:b/>
-          <w:bCs/>
-          <w:sz w:val="20"/>
-          <w:szCs w:val="20"/>
+        <w:spacing w:after="160" w:before="0"/>
+      </w:pPr>
+      <w:r>
+        <w:rPr>
+          <w:b/>
+          <w:bCs/>
+          <w:sz w:val="21"/>
+          <w:szCs w:val="21"/>
         </w:rPr>
         <w:t xml:space="preserve">Vehicle</w:t>
       </w:r>
       <w:r>
         <w:rPr>
-          <w:sz w:val="20"/>
-          <w:szCs w:val="20"/>
+          <w:sz w:val="21"/>
+          <w:szCs w:val="21"/>
         </w:rPr>
         <w:t xml:space="preserve">	:  </w:t>
       </w:r>
       <w:r>
         <w:rPr>
-          <w:sz w:val="20"/>
-          <w:szCs w:val="20"/>
+          <w:sz w:val="21"/>
+          <w:szCs w:val="21"/>
         </w:rPr>
         <w:t xml:space="preserve">{{VEHICLE}}</w:t>
       </w:r>
@@ -509,7 +651,7 @@
         <w:pBdr>
           <w:bottom w:val="single" w:color="cccccc" w:sz="4" w:space="4"/>
         </w:pBdr>
-        <w:spacing w:after="40" w:before="0"/>
+        <w:spacing w:after="60" w:before="0"/>
       </w:pPr>
       <w:r>
         <w:rPr>
@@ -518,23 +660,23 @@
           <w:bCs/>
           <w:caps/>
           <w:color w:val="1a1a2e"/>
-          <w:sz w:val="22"/>
-          <w:szCs w:val="22"/>
+          <w:sz w:val="23"/>
+          <w:szCs w:val="23"/>
         </w:rPr>
         <w:t xml:space="preserve">DECLARATION</w:t>
       </w:r>
     </w:p>
     <w:p>
       <w:pPr>
-        <w:spacing w:after="80" w:before="60"/>
+        <w:spacing w:after="100" w:before="80"/>
       </w:pPr>
       <w:r>
         <w:rPr>
           <w:i/>
           <w:iCs/>
           <w:color w:val="333333"/>
-          <w:sz w:val="20"/>
-          <w:szCs w:val="20"/>
+          <w:sz w:val="21"/>
+          <w:szCs w:val="21"/>
         </w:rPr>
         <w:t xml:space="preserve">I hereby declare that all the information provided above is true and correct to the best of my knowledge and belief.</w:t>
       </w:r>
@@ -544,40 +686,40 @@
         <w:tabs>
           <w:tab w:val="left" w:pos="4680"/>
         </w:tabs>
-        <w:spacing w:after="20" w:before="60"/>
-      </w:pPr>
-      <w:r>
-        <w:rPr>
-          <w:sz w:val="20"/>
-          <w:szCs w:val="20"/>
+        <w:spacing w:after="30" w:before="80"/>
+      </w:pPr>
+      <w:r>
+        <w:rPr>
+          <w:sz w:val="21"/>
+          <w:szCs w:val="21"/>
         </w:rPr>
         <w:t xml:space="preserve">Date: _______________</w:t>
       </w:r>
       <w:r>
         <w:rPr>
-          <w:sz w:val="20"/>
-          <w:szCs w:val="20"/>
+          <w:sz w:val="21"/>
+          <w:szCs w:val="21"/>
         </w:rPr>
         <w:t xml:space="preserve">	</w:t>
       </w:r>
       <w:r>
         <w:rPr>
-          <w:sz w:val="20"/>
-          <w:szCs w:val="20"/>
+          <w:sz w:val="21"/>
+          <w:szCs w:val="21"/>
         </w:rPr>
         <w:t xml:space="preserve">Signature: _______________</w:t>
       </w:r>
     </w:p>
     <w:p>
       <w:pPr>
-        <w:spacing w:after="0" w:before="60"/>
-      </w:pPr>
-      <w:r>
-        <w:rPr>
-          <w:b/>
-          <w:bCs/>
-          <w:sz w:val="20"/>
-          <w:szCs w:val="20"/>
+        <w:spacing w:after="0" w:before="80"/>
+      </w:pPr>
+      <w:r>
+        <w:rPr>
+          <w:b/>
+          <w:bCs/>
+          <w:sz w:val="21"/>
+          <w:szCs w:val="21"/>
         </w:rPr>
         <w:t xml:space="preserve">{{FULL_NAME}}</w:t>
       </w:r>
@@ -764,7 +906,7 @@
       <w:lvlText w:val="•"/>
       <w:lvlJc w:val="left"/>
       <w:pPr>
-        <w:spacing w:after="20" w:before="20"/>
+        <w:spacing w:after="40" w:before="40"/>
         <w:ind w:left="360" w:hanging="180"/>
       </w:pPr>
       <w:rPr>

</xml_diff>